<commit_message>
slight update to counterclaim template
</commit_message>
<xml_diff>
--- a/docassemble/VTSuperiorCourtDebtAnswer/data/templates/superior_court_debt_counterclaim.docx
+++ b/docassemble/VTSuperiorCourtDebtAnswer/data/templates/superior_court_debt_counterclaim.docx
@@ -1,6 +1,6 @@
 
 <file path=word/document.xml><?xml version="1.0" encoding="utf-8"?>
-<w:document xmlns:wpc="http://schemas.microsoft.com/office/word/2010/wordprocessingCanvas" xmlns:cx="http://schemas.microsoft.com/office/drawing/2014/chartex" xmlns:cx1="http://schemas.microsoft.com/office/drawing/2015/9/8/chartex" xmlns:cx2="http://schemas.microsoft.com/office/drawing/2015/10/21/chartex" xmlns:cx3="http://schemas.microsoft.com/office/drawing/2016/5/9/chartex" xmlns:cx4="http://schemas.microsoft.com/office/drawing/2016/5/10/chartex" xmlns:cx5="http://schemas.microsoft.com/office/drawing/2016/5/11/chartex" xmlns:cx6="http://schemas.microsoft.com/office/drawing/2016/5/12/chartex" xmlns:cx7="http://schemas.microsoft.com/office/drawing/2016/5/13/chartex" xmlns:cx8="http://schemas.microsoft.com/office/drawing/2016/5/14/chartex" xmlns:mc="http://schemas.openxmlformats.org/markup-compatibility/2006" xmlns:m="http://schemas.openxmlformats.org/officeDocument/2006/math" xmlns:aink="http://schemas.microsoft.com/office/drawing/2016/ink" xmlns:am3d="http://schemas.microsoft.com/office/drawing/2017/model3d" xmlns:oel="http://schemas.microsoft.com/office/2019/extlst" xmlns:r="http://schemas.openxmlformats.org/officeDocument/2006/relationships" xmlns:wp14="http://schemas.microsoft.com/office/word/2010/wordprocessingDrawing" xmlns:wp="http://schemas.openxmlformats.org/drawingml/2006/wordprocessingDrawing" xmlns:wpg="http://schemas.microsoft.com/office/word/2010/wordprocessingGroup" xmlns:wpi="http://schemas.microsoft.com/office/word/2010/wordprocessingInk" xmlns:wps="http://schemas.microsoft.com/office/word/2010/wordprocessingShape" xmlns:o="urn:schemas-microsoft-com:office:office" xmlns:v="urn:schemas-microsoft-com:vml" xmlns:w10="urn:schemas-microsoft-com:office:word" xmlns:w="http://schemas.openxmlformats.org/wordprocessingml/2006/main" xmlns:w14="http://schemas.microsoft.com/office/word/2010/wordml" xmlns:w15="http://schemas.microsoft.com/office/word/2012/wordml" xmlns:w16cex="http://schemas.microsoft.com/office/word/2018/wordml/cex" xmlns:w16cid="http://schemas.microsoft.com/office/word/2016/wordml/cid" xmlns:w16="http://schemas.microsoft.com/office/word/2018/wordml" xmlns:w16sdtdh="http://schemas.microsoft.com/office/word/2020/wordml/sdtdatahash" xmlns:w16sdtfl="http://schemas.microsoft.com/office/word/2024/wordml/sdtformatlock" xmlns:w16se="http://schemas.microsoft.com/office/word/2015/wordml/symex" xmlns:w16du="http://schemas.microsoft.com/office/word/2023/wordml/word16du" xmlns:wne="http://schemas.microsoft.com/office/word/2006/wordml" mc:Ignorable="w14 w15 w16se w16cid w16 w16cex w16sdtdh w16sdtfl w16du wp14">
+<w:document xmlns:wpc="http://schemas.microsoft.com/office/word/2010/wordprocessingCanvas" xmlns:cx="http://schemas.microsoft.com/office/drawing/2014/chartex" xmlns:cx1="http://schemas.microsoft.com/office/drawing/2015/9/8/chartex" xmlns:cx2="http://schemas.microsoft.com/office/drawing/2015/10/21/chartex" xmlns:cx3="http://schemas.microsoft.com/office/drawing/2016/5/9/chartex" xmlns:cx4="http://schemas.microsoft.com/office/drawing/2016/5/10/chartex" xmlns:cx5="http://schemas.microsoft.com/office/drawing/2016/5/11/chartex" xmlns:cx6="http://schemas.microsoft.com/office/drawing/2016/5/12/chartex" xmlns:cx7="http://schemas.microsoft.com/office/drawing/2016/5/13/chartex" xmlns:cx8="http://schemas.microsoft.com/office/drawing/2016/5/14/chartex" xmlns:mc="http://schemas.openxmlformats.org/markup-compatibility/2006" xmlns:aink="http://schemas.microsoft.com/office/drawing/2016/ink" xmlns:am3d="http://schemas.microsoft.com/office/drawing/2017/model3d" xmlns:o="urn:schemas-microsoft-com:office:office" xmlns:oel="http://schemas.microsoft.com/office/2019/extlst" xmlns:r="http://schemas.openxmlformats.org/officeDocument/2006/relationships" xmlns:m="http://schemas.openxmlformats.org/officeDocument/2006/math" xmlns:v="urn:schemas-microsoft-com:vml" xmlns:wp14="http://schemas.microsoft.com/office/word/2010/wordprocessingDrawing" xmlns:wp="http://schemas.openxmlformats.org/drawingml/2006/wordprocessingDrawing" xmlns:w10="urn:schemas-microsoft-com:office:word" xmlns:w="http://schemas.openxmlformats.org/wordprocessingml/2006/main" xmlns:w14="http://schemas.microsoft.com/office/word/2010/wordml" xmlns:w15="http://schemas.microsoft.com/office/word/2012/wordml" xmlns:w16cex="http://schemas.microsoft.com/office/word/2018/wordml/cex" xmlns:w16cid="http://schemas.microsoft.com/office/word/2016/wordml/cid" xmlns:w16="http://schemas.microsoft.com/office/word/2018/wordml" xmlns:w16du="http://schemas.microsoft.com/office/word/2023/wordml/word16du" xmlns:w16sdtdh="http://schemas.microsoft.com/office/word/2020/wordml/sdtdatahash" xmlns:w16sdtfl="http://schemas.microsoft.com/office/word/2024/wordml/sdtformatlock" xmlns:w16se="http://schemas.microsoft.com/office/word/2015/wordml/symex" xmlns:wpg="http://schemas.microsoft.com/office/word/2010/wordprocessingGroup" xmlns:wpi="http://schemas.microsoft.com/office/word/2010/wordprocessingInk" xmlns:wne="http://schemas.microsoft.com/office/word/2006/wordml" xmlns:wps="http://schemas.microsoft.com/office/word/2010/wordprocessingShape" mc:Ignorable="w14 w15 w16se w16cid w16 w16cex w16sdtdh w16sdtfl w16du wp14">
   <w:body>
     <w:p>
       <w:pPr>
@@ -89,15 +89,7 @@
         <w:pStyle w:val="BodyText"/>
       </w:pPr>
       <w:r>
-        <w:t xml:space="preserve">We are Defendants </w:t>
-      </w:r>
-      <w:proofErr w:type="gramStart"/>
-      <w:r>
-        <w:t>{{ users</w:t>
-      </w:r>
-      <w:proofErr w:type="gramEnd"/>
-      <w:r>
-        <w:t xml:space="preserve"> }}. We are representing ourselves.</w:t>
+        <w:t>We are Defendants {{ users }}. We are representing ourselves.</w:t>
       </w:r>
     </w:p>
     <w:p>
@@ -118,23 +110,7 @@
         <w:pStyle w:val="BodyText"/>
       </w:pPr>
       <w:r>
-        <w:t xml:space="preserve">I, </w:t>
-      </w:r>
-      <w:proofErr w:type="gramStart"/>
-      <w:r>
-        <w:t>{{ users</w:t>
-      </w:r>
-      <w:proofErr w:type="gramEnd"/>
-      <w:r>
-        <w:t>[0</w:t>
-      </w:r>
-      <w:proofErr w:type="gramStart"/>
-      <w:r>
-        <w:t>] }</w:t>
-      </w:r>
-      <w:proofErr w:type="gramEnd"/>
-      <w:r>
-        <w:t>}, am the Defendant in this case. I am representing myself.</w:t>
+        <w:t>I, {{ users[0] }}, am the Defendant in this case. I am representing myself.</w:t>
       </w:r>
     </w:p>
     <w:p>
@@ -172,21 +148,8 @@
           <w:numId w:val="12"/>
         </w:numPr>
       </w:pPr>
-      <w:proofErr w:type="gramStart"/>
-      <w:r>
-        <w:t>{{ single</w:t>
-      </w:r>
-      <w:proofErr w:type="gramEnd"/>
-      <w:r>
-        <w:t>_paragraph(fix_punctuation(merged_counterclaims_text)</w:t>
-      </w:r>
-      <w:proofErr w:type="gramStart"/>
-      <w:r>
-        <w:t>) }</w:t>
-      </w:r>
-      <w:proofErr w:type="gramEnd"/>
-      <w:r>
-        <w:t>}</w:t>
+      <w:r>
+        <w:t>{{ single_paragraph(fix_punctuation(merged_counterclaims_text)) }}</w:t>
       </w:r>
     </w:p>
     <w:p>
@@ -203,14 +166,6 @@
       </w:r>
       <w:r>
         <w:t>asking for:</w:t>
-      </w:r>
-    </w:p>
-    <w:p>
-      <w:pPr>
-        <w:pStyle w:val="BodyText"/>
-      </w:pPr>
-      <w:r>
-        <w:t>{%p if defined("counterclaims_amount") %}</w:t>
       </w:r>
     </w:p>
     <w:p>
@@ -222,28 +177,7 @@
         </w:numPr>
       </w:pPr>
       <w:r>
-        <w:t xml:space="preserve">Defendant is asking for money damages of </w:t>
-      </w:r>
-      <w:proofErr w:type="gramStart"/>
-      <w:r>
-        <w:t>{{ currency</w:t>
-      </w:r>
-      <w:proofErr w:type="gramEnd"/>
-      <w:r>
-        <w:t>(</w:t>
-      </w:r>
-      <w:proofErr w:type="spellStart"/>
-      <w:r>
-        <w:t>counterclaims_amount</w:t>
-      </w:r>
-      <w:proofErr w:type="spellEnd"/>
-      <w:proofErr w:type="gramStart"/>
-      <w:r>
-        <w:t>) }</w:t>
-      </w:r>
-      <w:proofErr w:type="gramEnd"/>
-      <w:r>
-        <w:t>}.</w:t>
+        <w:t>{%p if defined("counterclaims_amount") %}</w:t>
       </w:r>
     </w:p>
     <w:p>
@@ -255,42 +189,50 @@
         </w:numPr>
       </w:pPr>
       <w:r>
+        <w:t>Defendant is asking for money damages of {{ currency(counterclaims_amount) }}.</w:t>
+      </w:r>
+    </w:p>
+    <w:p>
+      <w:pPr>
+        <w:pStyle w:val="BodyText"/>
+        <w:numPr>
+          <w:ilvl w:val="0"/>
+          <w:numId w:val="9"/>
+        </w:numPr>
+      </w:pPr>
+      <w:r>
         <w:t>{%p endif %}</w:t>
       </w:r>
     </w:p>
     <w:p>
       <w:pPr>
         <w:pStyle w:val="BodyText"/>
-      </w:pPr>
-      <w:r>
-        <w:t>{%p for relief in counterclaim_</w:t>
-      </w:r>
-      <w:proofErr w:type="gramStart"/>
-      <w:r>
-        <w:t>reliefs.complete</w:t>
-      </w:r>
-      <w:proofErr w:type="gramEnd"/>
-      <w:r>
-        <w:t>_</w:t>
-      </w:r>
-      <w:proofErr w:type="gramStart"/>
-      <w:r>
-        <w:t>elements(</w:t>
-      </w:r>
-      <w:proofErr w:type="gramEnd"/>
-      <w:r>
-        <w:t>) %}</w:t>
-      </w:r>
-    </w:p>
-    <w:p>
-      <w:r>
-        <w:t xml:space="preserve">Defendant is also asking for: </w:t>
-      </w:r>
-      <w:proofErr w:type="gramStart"/>
-      <w:r>
-        <w:t>{{ relief.name</w:t>
-      </w:r>
-      <w:proofErr w:type="gramEnd"/>
+        <w:numPr>
+          <w:ilvl w:val="0"/>
+          <w:numId w:val="9"/>
+        </w:numPr>
+      </w:pPr>
+      <w:r>
+        <w:t>{%p for relief in counterclaim_reliefs.complete_elements() %}</w:t>
+      </w:r>
+    </w:p>
+    <w:p>
+      <w:pPr>
+        <w:pStyle w:val="BodyText"/>
+        <w:numPr>
+          <w:ilvl w:val="0"/>
+          <w:numId w:val="9"/>
+        </w:numPr>
+      </w:pPr>
+      <w:r>
+        <w:t xml:space="preserve">{{ </w:t>
+      </w:r>
+      <w:r>
+        <w:t>relief</w:t>
+      </w:r>
+      <w:r>
+        <w:t>.name</w:t>
+      </w:r>
       <w:r>
         <w:t xml:space="preserve"> }}</w:t>
       </w:r>
@@ -298,10 +240,19 @@
     <w:p>
       <w:pPr>
         <w:pStyle w:val="BodyText"/>
+        <w:numPr>
+          <w:ilvl w:val="0"/>
+          <w:numId w:val="9"/>
+        </w:numPr>
       </w:pPr>
       <w:r>
         <w:t>{%p endfor %}</w:t>
       </w:r>
+    </w:p>
+    <w:p>
+      <w:pPr>
+        <w:pStyle w:val="BodyText"/>
+      </w:pPr>
     </w:p>
     <w:p>
       <w:pPr>
@@ -361,6 +312,7 @@
         <w:pStyle w:val="BodyText"/>
       </w:pPr>
       <w:r>
+        <w:lastRenderedPageBreak/>
         <w:t>Defendant</w:t>
       </w:r>
       <w:r>
@@ -370,11 +322,7 @@
         <w:t>s</w:t>
       </w:r>
       <w:r>
-        <w:t xml:space="preserve"> that anything I file with the Court must be sent to every party in the case, </w:t>
-      </w:r>
-      <w:r>
-        <w:lastRenderedPageBreak/>
-        <w:t>and that I must file a Certificate of Service form with each filing showing that I did</w:t>
+        <w:t xml:space="preserve"> that anything I file with the Court must be sent to every party in the case, and that I must file a Certificate of Service form with each filing showing that I did</w:t>
       </w:r>
       <w:r>
         <w:rPr>
@@ -449,23 +397,7 @@
         <w:pStyle w:val="BodyText"/>
       </w:pPr>
       <w:r>
-        <w:t xml:space="preserve">{{p </w:t>
-      </w:r>
-      <w:proofErr w:type="spellStart"/>
-      <w:r>
-        <w:t>include_docx_template</w:t>
-      </w:r>
-      <w:proofErr w:type="spellEnd"/>
-      <w:r>
-        <w:t>('include_signature.docx'</w:t>
-      </w:r>
-      <w:proofErr w:type="gramStart"/>
-      <w:r>
-        <w:t>) }</w:t>
-      </w:r>
-      <w:proofErr w:type="gramEnd"/>
-      <w:r>
-        <w:t>}</w:t>
+        <w:t>{{p include_docx_template('include_signature.docx') }}</w:t>
       </w:r>
     </w:p>
     <w:p>
@@ -486,7 +418,7 @@
 </file>
 
 <file path=word/endnotes.xml><?xml version="1.0" encoding="utf-8"?>
-<w:endnotes xmlns:wpc="http://schemas.microsoft.com/office/word/2010/wordprocessingCanvas" xmlns:cx="http://schemas.microsoft.com/office/drawing/2014/chartex" xmlns:cx1="http://schemas.microsoft.com/office/drawing/2015/9/8/chartex" xmlns:cx2="http://schemas.microsoft.com/office/drawing/2015/10/21/chartex" xmlns:cx3="http://schemas.microsoft.com/office/drawing/2016/5/9/chartex" xmlns:cx4="http://schemas.microsoft.com/office/drawing/2016/5/10/chartex" xmlns:cx5="http://schemas.microsoft.com/office/drawing/2016/5/11/chartex" xmlns:cx6="http://schemas.microsoft.com/office/drawing/2016/5/12/chartex" xmlns:cx7="http://schemas.microsoft.com/office/drawing/2016/5/13/chartex" xmlns:cx8="http://schemas.microsoft.com/office/drawing/2016/5/14/chartex" xmlns:mc="http://schemas.openxmlformats.org/markup-compatibility/2006" xmlns:m="http://schemas.openxmlformats.org/officeDocument/2006/math" xmlns:aink="http://schemas.microsoft.com/office/drawing/2016/ink" xmlns:am3d="http://schemas.microsoft.com/office/drawing/2017/model3d" xmlns:oel="http://schemas.microsoft.com/office/2019/extlst" xmlns:r="http://schemas.openxmlformats.org/officeDocument/2006/relationships" xmlns:wp14="http://schemas.microsoft.com/office/word/2010/wordprocessingDrawing" xmlns:wp="http://schemas.openxmlformats.org/drawingml/2006/wordprocessingDrawing" xmlns:wpg="http://schemas.microsoft.com/office/word/2010/wordprocessingGroup" xmlns:wpi="http://schemas.microsoft.com/office/word/2010/wordprocessingInk" xmlns:wps="http://schemas.microsoft.com/office/word/2010/wordprocessingShape" xmlns:o="urn:schemas-microsoft-com:office:office" xmlns:v="urn:schemas-microsoft-com:vml" xmlns:w10="urn:schemas-microsoft-com:office:word" xmlns:w="http://schemas.openxmlformats.org/wordprocessingml/2006/main" xmlns:w14="http://schemas.microsoft.com/office/word/2010/wordml" xmlns:w15="http://schemas.microsoft.com/office/word/2012/wordml" xmlns:w16cex="http://schemas.microsoft.com/office/word/2018/wordml/cex" xmlns:w16cid="http://schemas.microsoft.com/office/word/2016/wordml/cid" xmlns:w16="http://schemas.microsoft.com/office/word/2018/wordml" xmlns:w16sdtdh="http://schemas.microsoft.com/office/word/2020/wordml/sdtdatahash" xmlns:w16sdtfl="http://schemas.microsoft.com/office/word/2024/wordml/sdtformatlock" xmlns:w16se="http://schemas.microsoft.com/office/word/2015/wordml/symex" xmlns:w16du="http://schemas.microsoft.com/office/word/2023/wordml/word16du" xmlns:wne="http://schemas.microsoft.com/office/word/2006/wordml" mc:Ignorable="w14 w15 w16se w16cid w16 w16cex w16sdtdh w16sdtfl w16du wp14">
+<w:endnotes xmlns:wpc="http://schemas.microsoft.com/office/word/2010/wordprocessingCanvas" xmlns:cx="http://schemas.microsoft.com/office/drawing/2014/chartex" xmlns:cx1="http://schemas.microsoft.com/office/drawing/2015/9/8/chartex" xmlns:cx2="http://schemas.microsoft.com/office/drawing/2015/10/21/chartex" xmlns:cx3="http://schemas.microsoft.com/office/drawing/2016/5/9/chartex" xmlns:cx4="http://schemas.microsoft.com/office/drawing/2016/5/10/chartex" xmlns:cx5="http://schemas.microsoft.com/office/drawing/2016/5/11/chartex" xmlns:cx6="http://schemas.microsoft.com/office/drawing/2016/5/12/chartex" xmlns:cx7="http://schemas.microsoft.com/office/drawing/2016/5/13/chartex" xmlns:cx8="http://schemas.microsoft.com/office/drawing/2016/5/14/chartex" xmlns:mc="http://schemas.openxmlformats.org/markup-compatibility/2006" xmlns:aink="http://schemas.microsoft.com/office/drawing/2016/ink" xmlns:am3d="http://schemas.microsoft.com/office/drawing/2017/model3d" xmlns:o="urn:schemas-microsoft-com:office:office" xmlns:oel="http://schemas.microsoft.com/office/2019/extlst" xmlns:r="http://schemas.openxmlformats.org/officeDocument/2006/relationships" xmlns:m="http://schemas.openxmlformats.org/officeDocument/2006/math" xmlns:v="urn:schemas-microsoft-com:vml" xmlns:wp14="http://schemas.microsoft.com/office/word/2010/wordprocessingDrawing" xmlns:wp="http://schemas.openxmlformats.org/drawingml/2006/wordprocessingDrawing" xmlns:w10="urn:schemas-microsoft-com:office:word" xmlns:w="http://schemas.openxmlformats.org/wordprocessingml/2006/main" xmlns:w14="http://schemas.microsoft.com/office/word/2010/wordml" xmlns:w15="http://schemas.microsoft.com/office/word/2012/wordml" xmlns:w16cex="http://schemas.microsoft.com/office/word/2018/wordml/cex" xmlns:w16cid="http://schemas.microsoft.com/office/word/2016/wordml/cid" xmlns:w16="http://schemas.microsoft.com/office/word/2018/wordml" xmlns:w16du="http://schemas.microsoft.com/office/word/2023/wordml/word16du" xmlns:w16sdtdh="http://schemas.microsoft.com/office/word/2020/wordml/sdtdatahash" xmlns:w16sdtfl="http://schemas.microsoft.com/office/word/2024/wordml/sdtformatlock" xmlns:w16se="http://schemas.microsoft.com/office/word/2015/wordml/symex" xmlns:wpg="http://schemas.microsoft.com/office/word/2010/wordprocessingGroup" xmlns:wpi="http://schemas.microsoft.com/office/word/2010/wordprocessingInk" xmlns:wne="http://schemas.microsoft.com/office/word/2006/wordml" xmlns:wps="http://schemas.microsoft.com/office/word/2010/wordprocessingShape" mc:Ignorable="w14 w15 w16se w16cid w16 w16cex w16sdtdh w16sdtfl w16du wp14">
   <w:endnote w:type="separator" w:id="-1">
     <w:p>
       <w:r>
@@ -505,7 +437,7 @@
 </file>
 
 <file path=word/footer1.xml><?xml version="1.0" encoding="utf-8"?>
-<w:ftr xmlns:wpc="http://schemas.microsoft.com/office/word/2010/wordprocessingCanvas" xmlns:cx="http://schemas.microsoft.com/office/drawing/2014/chartex" xmlns:cx1="http://schemas.microsoft.com/office/drawing/2015/9/8/chartex" xmlns:cx2="http://schemas.microsoft.com/office/drawing/2015/10/21/chartex" xmlns:cx3="http://schemas.microsoft.com/office/drawing/2016/5/9/chartex" xmlns:cx4="http://schemas.microsoft.com/office/drawing/2016/5/10/chartex" xmlns:cx5="http://schemas.microsoft.com/office/drawing/2016/5/11/chartex" xmlns:cx6="http://schemas.microsoft.com/office/drawing/2016/5/12/chartex" xmlns:cx7="http://schemas.microsoft.com/office/drawing/2016/5/13/chartex" xmlns:cx8="http://schemas.microsoft.com/office/drawing/2016/5/14/chartex" xmlns:mc="http://schemas.openxmlformats.org/markup-compatibility/2006" xmlns:m="http://schemas.openxmlformats.org/officeDocument/2006/math" xmlns:aink="http://schemas.microsoft.com/office/drawing/2016/ink" xmlns:am3d="http://schemas.microsoft.com/office/drawing/2017/model3d" xmlns:oel="http://schemas.microsoft.com/office/2019/extlst" xmlns:r="http://schemas.openxmlformats.org/officeDocument/2006/relationships" xmlns:wp14="http://schemas.microsoft.com/office/word/2010/wordprocessingDrawing" xmlns:wp="http://schemas.openxmlformats.org/drawingml/2006/wordprocessingDrawing" xmlns:wpg="http://schemas.microsoft.com/office/word/2010/wordprocessingGroup" xmlns:wpi="http://schemas.microsoft.com/office/word/2010/wordprocessingInk" xmlns:wps="http://schemas.microsoft.com/office/word/2010/wordprocessingShape" xmlns:o="urn:schemas-microsoft-com:office:office" xmlns:v="urn:schemas-microsoft-com:vml" xmlns:w10="urn:schemas-microsoft-com:office:word" xmlns:w="http://schemas.openxmlformats.org/wordprocessingml/2006/main" xmlns:w14="http://schemas.microsoft.com/office/word/2010/wordml" xmlns:w15="http://schemas.microsoft.com/office/word/2012/wordml" xmlns:w16cex="http://schemas.microsoft.com/office/word/2018/wordml/cex" xmlns:w16cid="http://schemas.microsoft.com/office/word/2016/wordml/cid" xmlns:w16="http://schemas.microsoft.com/office/word/2018/wordml" xmlns:w16sdtdh="http://schemas.microsoft.com/office/word/2020/wordml/sdtdatahash" xmlns:w16sdtfl="http://schemas.microsoft.com/office/word/2024/wordml/sdtformatlock" xmlns:w16se="http://schemas.microsoft.com/office/word/2015/wordml/symex" xmlns:w16du="http://schemas.microsoft.com/office/word/2023/wordml/word16du" xmlns:wne="http://schemas.microsoft.com/office/word/2006/wordml" mc:Ignorable="w14 w15 w16se w16cid w16 w16cex w16sdtdh w16sdtfl w16du wp14">
+<w:ftr xmlns:wpc="http://schemas.microsoft.com/office/word/2010/wordprocessingCanvas" xmlns:cx="http://schemas.microsoft.com/office/drawing/2014/chartex" xmlns:cx1="http://schemas.microsoft.com/office/drawing/2015/9/8/chartex" xmlns:cx2="http://schemas.microsoft.com/office/drawing/2015/10/21/chartex" xmlns:cx3="http://schemas.microsoft.com/office/drawing/2016/5/9/chartex" xmlns:cx4="http://schemas.microsoft.com/office/drawing/2016/5/10/chartex" xmlns:cx5="http://schemas.microsoft.com/office/drawing/2016/5/11/chartex" xmlns:cx6="http://schemas.microsoft.com/office/drawing/2016/5/12/chartex" xmlns:cx7="http://schemas.microsoft.com/office/drawing/2016/5/13/chartex" xmlns:cx8="http://schemas.microsoft.com/office/drawing/2016/5/14/chartex" xmlns:mc="http://schemas.openxmlformats.org/markup-compatibility/2006" xmlns:aink="http://schemas.microsoft.com/office/drawing/2016/ink" xmlns:am3d="http://schemas.microsoft.com/office/drawing/2017/model3d" xmlns:o="urn:schemas-microsoft-com:office:office" xmlns:oel="http://schemas.microsoft.com/office/2019/extlst" xmlns:r="http://schemas.openxmlformats.org/officeDocument/2006/relationships" xmlns:m="http://schemas.openxmlformats.org/officeDocument/2006/math" xmlns:v="urn:schemas-microsoft-com:vml" xmlns:wp14="http://schemas.microsoft.com/office/word/2010/wordprocessingDrawing" xmlns:wp="http://schemas.openxmlformats.org/drawingml/2006/wordprocessingDrawing" xmlns:w10="urn:schemas-microsoft-com:office:word" xmlns:w="http://schemas.openxmlformats.org/wordprocessingml/2006/main" xmlns:w14="http://schemas.microsoft.com/office/word/2010/wordml" xmlns:w15="http://schemas.microsoft.com/office/word/2012/wordml" xmlns:w16cex="http://schemas.microsoft.com/office/word/2018/wordml/cex" xmlns:w16cid="http://schemas.microsoft.com/office/word/2016/wordml/cid" xmlns:w16="http://schemas.microsoft.com/office/word/2018/wordml" xmlns:w16du="http://schemas.microsoft.com/office/word/2023/wordml/word16du" xmlns:w16sdtdh="http://schemas.microsoft.com/office/word/2020/wordml/sdtdatahash" xmlns:w16sdtfl="http://schemas.microsoft.com/office/word/2024/wordml/sdtformatlock" xmlns:w16se="http://schemas.microsoft.com/office/word/2015/wordml/symex" xmlns:wpg="http://schemas.microsoft.com/office/word/2010/wordprocessingGroup" xmlns:wpi="http://schemas.microsoft.com/office/word/2010/wordprocessingInk" xmlns:wne="http://schemas.microsoft.com/office/word/2006/wordml" xmlns:wps="http://schemas.microsoft.com/office/word/2010/wordprocessingShape" mc:Ignorable="w14 w15 w16se w16cid w16 w16cex w16sdtdh w16sdtfl w16du wp14">
   <w:p>
     <w:pPr>
       <w:pStyle w:val="Footer"/>
@@ -637,25 +569,7 @@
         <w:sz w:val="20"/>
         <w:szCs w:val="20"/>
       </w:rPr>
-      <w:t xml:space="preserve">Prepared with </w:t>
-    </w:r>
-    <w:proofErr w:type="spellStart"/>
-    <w:r>
-      <w:rPr>
-        <w:rFonts w:ascii="Times New Roman" w:hAnsi="Times New Roman" w:cs="Times New Roman"/>
-        <w:sz w:val="20"/>
-        <w:szCs w:val="20"/>
-      </w:rPr>
-      <w:t>VTCourtForms</w:t>
-    </w:r>
-    <w:proofErr w:type="spellEnd"/>
-    <w:r>
-      <w:rPr>
-        <w:rFonts w:ascii="Times New Roman" w:hAnsi="Times New Roman" w:cs="Times New Roman"/>
-        <w:sz w:val="20"/>
-        <w:szCs w:val="20"/>
-      </w:rPr>
-      <w:t xml:space="preserve"> tool</w:t>
+      <w:t>Prepared with VTCourtForms tool</w:t>
     </w:r>
     <w:r>
       <w:rPr>
@@ -678,7 +592,7 @@
 </file>
 
 <file path=word/footnotes.xml><?xml version="1.0" encoding="utf-8"?>
-<w:footnotes xmlns:wpc="http://schemas.microsoft.com/office/word/2010/wordprocessingCanvas" xmlns:cx="http://schemas.microsoft.com/office/drawing/2014/chartex" xmlns:cx1="http://schemas.microsoft.com/office/drawing/2015/9/8/chartex" xmlns:cx2="http://schemas.microsoft.com/office/drawing/2015/10/21/chartex" xmlns:cx3="http://schemas.microsoft.com/office/drawing/2016/5/9/chartex" xmlns:cx4="http://schemas.microsoft.com/office/drawing/2016/5/10/chartex" xmlns:cx5="http://schemas.microsoft.com/office/drawing/2016/5/11/chartex" xmlns:cx6="http://schemas.microsoft.com/office/drawing/2016/5/12/chartex" xmlns:cx7="http://schemas.microsoft.com/office/drawing/2016/5/13/chartex" xmlns:cx8="http://schemas.microsoft.com/office/drawing/2016/5/14/chartex" xmlns:mc="http://schemas.openxmlformats.org/markup-compatibility/2006" xmlns:m="http://schemas.openxmlformats.org/officeDocument/2006/math" xmlns:aink="http://schemas.microsoft.com/office/drawing/2016/ink" xmlns:am3d="http://schemas.microsoft.com/office/drawing/2017/model3d" xmlns:oel="http://schemas.microsoft.com/office/2019/extlst" xmlns:r="http://schemas.openxmlformats.org/officeDocument/2006/relationships" xmlns:wp14="http://schemas.microsoft.com/office/word/2010/wordprocessingDrawing" xmlns:wp="http://schemas.openxmlformats.org/drawingml/2006/wordprocessingDrawing" xmlns:wpg="http://schemas.microsoft.com/office/word/2010/wordprocessingGroup" xmlns:wpi="http://schemas.microsoft.com/office/word/2010/wordprocessingInk" xmlns:wps="http://schemas.microsoft.com/office/word/2010/wordprocessingShape" xmlns:o="urn:schemas-microsoft-com:office:office" xmlns:v="urn:schemas-microsoft-com:vml" xmlns:w10="urn:schemas-microsoft-com:office:word" xmlns:w="http://schemas.openxmlformats.org/wordprocessingml/2006/main" xmlns:w14="http://schemas.microsoft.com/office/word/2010/wordml" xmlns:w15="http://schemas.microsoft.com/office/word/2012/wordml" xmlns:w16cex="http://schemas.microsoft.com/office/word/2018/wordml/cex" xmlns:w16cid="http://schemas.microsoft.com/office/word/2016/wordml/cid" xmlns:w16="http://schemas.microsoft.com/office/word/2018/wordml" xmlns:w16sdtdh="http://schemas.microsoft.com/office/word/2020/wordml/sdtdatahash" xmlns:w16sdtfl="http://schemas.microsoft.com/office/word/2024/wordml/sdtformatlock" xmlns:w16se="http://schemas.microsoft.com/office/word/2015/wordml/symex" xmlns:w16du="http://schemas.microsoft.com/office/word/2023/wordml/word16du" xmlns:wne="http://schemas.microsoft.com/office/word/2006/wordml" mc:Ignorable="w14 w15 w16se w16cid w16 w16cex w16sdtdh w16sdtfl w16du wp14">
+<w:footnotes xmlns:wpc="http://schemas.microsoft.com/office/word/2010/wordprocessingCanvas" xmlns:cx="http://schemas.microsoft.com/office/drawing/2014/chartex" xmlns:cx1="http://schemas.microsoft.com/office/drawing/2015/9/8/chartex" xmlns:cx2="http://schemas.microsoft.com/office/drawing/2015/10/21/chartex" xmlns:cx3="http://schemas.microsoft.com/office/drawing/2016/5/9/chartex" xmlns:cx4="http://schemas.microsoft.com/office/drawing/2016/5/10/chartex" xmlns:cx5="http://schemas.microsoft.com/office/drawing/2016/5/11/chartex" xmlns:cx6="http://schemas.microsoft.com/office/drawing/2016/5/12/chartex" xmlns:cx7="http://schemas.microsoft.com/office/drawing/2016/5/13/chartex" xmlns:cx8="http://schemas.microsoft.com/office/drawing/2016/5/14/chartex" xmlns:mc="http://schemas.openxmlformats.org/markup-compatibility/2006" xmlns:aink="http://schemas.microsoft.com/office/drawing/2016/ink" xmlns:am3d="http://schemas.microsoft.com/office/drawing/2017/model3d" xmlns:o="urn:schemas-microsoft-com:office:office" xmlns:oel="http://schemas.microsoft.com/office/2019/extlst" xmlns:r="http://schemas.openxmlformats.org/officeDocument/2006/relationships" xmlns:m="http://schemas.openxmlformats.org/officeDocument/2006/math" xmlns:v="urn:schemas-microsoft-com:vml" xmlns:wp14="http://schemas.microsoft.com/office/word/2010/wordprocessingDrawing" xmlns:wp="http://schemas.openxmlformats.org/drawingml/2006/wordprocessingDrawing" xmlns:w10="urn:schemas-microsoft-com:office:word" xmlns:w="http://schemas.openxmlformats.org/wordprocessingml/2006/main" xmlns:w14="http://schemas.microsoft.com/office/word/2010/wordml" xmlns:w15="http://schemas.microsoft.com/office/word/2012/wordml" xmlns:w16cex="http://schemas.microsoft.com/office/word/2018/wordml/cex" xmlns:w16cid="http://schemas.microsoft.com/office/word/2016/wordml/cid" xmlns:w16="http://schemas.microsoft.com/office/word/2018/wordml" xmlns:w16du="http://schemas.microsoft.com/office/word/2023/wordml/word16du" xmlns:w16sdtdh="http://schemas.microsoft.com/office/word/2020/wordml/sdtdatahash" xmlns:w16sdtfl="http://schemas.microsoft.com/office/word/2024/wordml/sdtformatlock" xmlns:w16se="http://schemas.microsoft.com/office/word/2015/wordml/symex" xmlns:wpg="http://schemas.microsoft.com/office/word/2010/wordprocessingGroup" xmlns:wpi="http://schemas.microsoft.com/office/word/2010/wordprocessingInk" xmlns:wne="http://schemas.microsoft.com/office/word/2006/wordml" xmlns:wps="http://schemas.microsoft.com/office/word/2010/wordprocessingShape" mc:Ignorable="w14 w15 w16se w16cid w16 w16cex w16sdtdh w16sdtfl w16du wp14">
   <w:footnote w:type="separator" w:id="-1">
     <w:p>
       <w:r>
@@ -697,7 +611,7 @@
 </file>
 
 <file path=word/numbering.xml><?xml version="1.0" encoding="utf-8"?>
-<w:numbering xmlns:wpc="http://schemas.microsoft.com/office/word/2010/wordprocessingCanvas" xmlns:cx="http://schemas.microsoft.com/office/drawing/2014/chartex" xmlns:cx1="http://schemas.microsoft.com/office/drawing/2015/9/8/chartex" xmlns:cx2="http://schemas.microsoft.com/office/drawing/2015/10/21/chartex" xmlns:cx3="http://schemas.microsoft.com/office/drawing/2016/5/9/chartex" xmlns:cx4="http://schemas.microsoft.com/office/drawing/2016/5/10/chartex" xmlns:cx5="http://schemas.microsoft.com/office/drawing/2016/5/11/chartex" xmlns:cx6="http://schemas.microsoft.com/office/drawing/2016/5/12/chartex" xmlns:cx7="http://schemas.microsoft.com/office/drawing/2016/5/13/chartex" xmlns:cx8="http://schemas.microsoft.com/office/drawing/2016/5/14/chartex" xmlns:mc="http://schemas.openxmlformats.org/markup-compatibility/2006" xmlns:m="http://schemas.openxmlformats.org/officeDocument/2006/math" xmlns:aink="http://schemas.microsoft.com/office/drawing/2016/ink" xmlns:am3d="http://schemas.microsoft.com/office/drawing/2017/model3d" xmlns:oel="http://schemas.microsoft.com/office/2019/extlst" xmlns:r="http://schemas.openxmlformats.org/officeDocument/2006/relationships" xmlns:wp14="http://schemas.microsoft.com/office/word/2010/wordprocessingDrawing" xmlns:wp="http://schemas.openxmlformats.org/drawingml/2006/wordprocessingDrawing" xmlns:wpg="http://schemas.microsoft.com/office/word/2010/wordprocessingGroup" xmlns:wpi="http://schemas.microsoft.com/office/word/2010/wordprocessingInk" xmlns:wps="http://schemas.microsoft.com/office/word/2010/wordprocessingShape" xmlns:o="urn:schemas-microsoft-com:office:office" xmlns:v="urn:schemas-microsoft-com:vml" xmlns:w10="urn:schemas-microsoft-com:office:word" xmlns:w="http://schemas.openxmlformats.org/wordprocessingml/2006/main" xmlns:w14="http://schemas.microsoft.com/office/word/2010/wordml" xmlns:w15="http://schemas.microsoft.com/office/word/2012/wordml" xmlns:w16cex="http://schemas.microsoft.com/office/word/2018/wordml/cex" xmlns:w16cid="http://schemas.microsoft.com/office/word/2016/wordml/cid" xmlns:w16="http://schemas.microsoft.com/office/word/2018/wordml" xmlns:w16sdtdh="http://schemas.microsoft.com/office/word/2020/wordml/sdtdatahash" xmlns:w16sdtfl="http://schemas.microsoft.com/office/word/2024/wordml/sdtformatlock" xmlns:w16se="http://schemas.microsoft.com/office/word/2015/wordml/symex" xmlns:w16du="http://schemas.microsoft.com/office/word/2023/wordml/word16du" xmlns:wne="http://schemas.microsoft.com/office/word/2006/wordml" mc:Ignorable="w14 w15 w16se w16cid w16 w16cex w16sdtdh w16sdtfl w16du wp14">
+<w:numbering xmlns:wpc="http://schemas.microsoft.com/office/word/2010/wordprocessingCanvas" xmlns:cx="http://schemas.microsoft.com/office/drawing/2014/chartex" xmlns:cx1="http://schemas.microsoft.com/office/drawing/2015/9/8/chartex" xmlns:cx2="http://schemas.microsoft.com/office/drawing/2015/10/21/chartex" xmlns:cx3="http://schemas.microsoft.com/office/drawing/2016/5/9/chartex" xmlns:cx4="http://schemas.microsoft.com/office/drawing/2016/5/10/chartex" xmlns:cx5="http://schemas.microsoft.com/office/drawing/2016/5/11/chartex" xmlns:cx6="http://schemas.microsoft.com/office/drawing/2016/5/12/chartex" xmlns:cx7="http://schemas.microsoft.com/office/drawing/2016/5/13/chartex" xmlns:cx8="http://schemas.microsoft.com/office/drawing/2016/5/14/chartex" xmlns:mc="http://schemas.openxmlformats.org/markup-compatibility/2006" xmlns:aink="http://schemas.microsoft.com/office/drawing/2016/ink" xmlns:am3d="http://schemas.microsoft.com/office/drawing/2017/model3d" xmlns:o="urn:schemas-microsoft-com:office:office" xmlns:oel="http://schemas.microsoft.com/office/2019/extlst" xmlns:r="http://schemas.openxmlformats.org/officeDocument/2006/relationships" xmlns:m="http://schemas.openxmlformats.org/officeDocument/2006/math" xmlns:v="urn:schemas-microsoft-com:vml" xmlns:wp14="http://schemas.microsoft.com/office/word/2010/wordprocessingDrawing" xmlns:wp="http://schemas.openxmlformats.org/drawingml/2006/wordprocessingDrawing" xmlns:w10="urn:schemas-microsoft-com:office:word" xmlns:w="http://schemas.openxmlformats.org/wordprocessingml/2006/main" xmlns:w14="http://schemas.microsoft.com/office/word/2010/wordml" xmlns:w15="http://schemas.microsoft.com/office/word/2012/wordml" xmlns:w16cex="http://schemas.microsoft.com/office/word/2018/wordml/cex" xmlns:w16cid="http://schemas.microsoft.com/office/word/2016/wordml/cid" xmlns:w16="http://schemas.microsoft.com/office/word/2018/wordml" xmlns:w16du="http://schemas.microsoft.com/office/word/2023/wordml/word16du" xmlns:w16sdtdh="http://schemas.microsoft.com/office/word/2020/wordml/sdtdatahash" xmlns:w16sdtfl="http://schemas.microsoft.com/office/word/2024/wordml/sdtformatlock" xmlns:w16se="http://schemas.microsoft.com/office/word/2015/wordml/symex" xmlns:wpg="http://schemas.microsoft.com/office/word/2010/wordprocessingGroup" xmlns:wpi="http://schemas.microsoft.com/office/word/2010/wordprocessingInk" xmlns:wne="http://schemas.microsoft.com/office/word/2006/wordml" xmlns:wps="http://schemas.microsoft.com/office/word/2010/wordprocessingShape" mc:Ignorable="w14 w15 w16se w16cid w16 w16cex w16sdtdh w16sdtfl w16du wp14">
   <w:abstractNum w:abstractNumId="0" w15:restartNumberingAfterBreak="0">
     <w:nsid w:val="05BA618A"/>
     <w:multiLevelType w:val="hybridMultilevel"/>
@@ -1932,7 +1846,7 @@
 </file>
 
 <file path=word/styles.xml><?xml version="1.0" encoding="utf-8"?>
-<w:styles xmlns:mc="http://schemas.openxmlformats.org/markup-compatibility/2006" xmlns:r="http://schemas.openxmlformats.org/officeDocument/2006/relationships" xmlns:w="http://schemas.openxmlformats.org/wordprocessingml/2006/main" xmlns:w14="http://schemas.microsoft.com/office/word/2010/wordml" xmlns:w15="http://schemas.microsoft.com/office/word/2012/wordml" xmlns:w16cex="http://schemas.microsoft.com/office/word/2018/wordml/cex" xmlns:w16cid="http://schemas.microsoft.com/office/word/2016/wordml/cid" xmlns:w16="http://schemas.microsoft.com/office/word/2018/wordml" xmlns:w16sdtdh="http://schemas.microsoft.com/office/word/2020/wordml/sdtdatahash" xmlns:w16sdtfl="http://schemas.microsoft.com/office/word/2024/wordml/sdtformatlock" xmlns:w16se="http://schemas.microsoft.com/office/word/2015/wordml/symex" xmlns:w16du="http://schemas.microsoft.com/office/word/2023/wordml/word16du" mc:Ignorable="w14 w15 w16se w16cid w16 w16cex w16sdtdh w16sdtfl w16du">
+<w:styles xmlns:mc="http://schemas.openxmlformats.org/markup-compatibility/2006" xmlns:r="http://schemas.openxmlformats.org/officeDocument/2006/relationships" xmlns:w="http://schemas.openxmlformats.org/wordprocessingml/2006/main" xmlns:w14="http://schemas.microsoft.com/office/word/2010/wordml" xmlns:w15="http://schemas.microsoft.com/office/word/2012/wordml" xmlns:w16cex="http://schemas.microsoft.com/office/word/2018/wordml/cex" xmlns:w16cid="http://schemas.microsoft.com/office/word/2016/wordml/cid" xmlns:w16="http://schemas.microsoft.com/office/word/2018/wordml" xmlns:w16du="http://schemas.microsoft.com/office/word/2023/wordml/word16du" xmlns:w16sdtdh="http://schemas.microsoft.com/office/word/2020/wordml/sdtdatahash" xmlns:w16sdtfl="http://schemas.microsoft.com/office/word/2024/wordml/sdtformatlock" xmlns:w16se="http://schemas.microsoft.com/office/word/2015/wordml/symex" mc:Ignorable="w14 w15 w16se w16cid w16 w16cex w16sdtdh w16sdtfl w16du">
   <w:docDefaults>
     <w:rPrDefault>
       <w:rPr>

</xml_diff>

<commit_message>
updated metadata of answer and counterclaim templates; and made a text edit on counterclaim
</commit_message>
<xml_diff>
--- a/docassemble/VTSuperiorCourtDebtAnswer/data/templates/superior_court_debt_counterclaim.docx
+++ b/docassemble/VTSuperiorCourtDebtAnswer/data/templates/superior_court_debt_counterclaim.docx
@@ -1,6 +1,6 @@
 
 <file path=word/document.xml><?xml version="1.0" encoding="utf-8"?>
-<w:document xmlns:wpc="http://schemas.microsoft.com/office/word/2010/wordprocessingCanvas" xmlns:cx="http://schemas.microsoft.com/office/drawing/2014/chartex" xmlns:cx1="http://schemas.microsoft.com/office/drawing/2015/9/8/chartex" xmlns:cx2="http://schemas.microsoft.com/office/drawing/2015/10/21/chartex" xmlns:cx3="http://schemas.microsoft.com/office/drawing/2016/5/9/chartex" xmlns:cx4="http://schemas.microsoft.com/office/drawing/2016/5/10/chartex" xmlns:cx5="http://schemas.microsoft.com/office/drawing/2016/5/11/chartex" xmlns:cx6="http://schemas.microsoft.com/office/drawing/2016/5/12/chartex" xmlns:cx7="http://schemas.microsoft.com/office/drawing/2016/5/13/chartex" xmlns:cx8="http://schemas.microsoft.com/office/drawing/2016/5/14/chartex" xmlns:mc="http://schemas.openxmlformats.org/markup-compatibility/2006" xmlns:m="http://schemas.openxmlformats.org/officeDocument/2006/math" xmlns:aink="http://schemas.microsoft.com/office/drawing/2016/ink" xmlns:am3d="http://schemas.microsoft.com/office/drawing/2017/model3d" xmlns:oel="http://schemas.microsoft.com/office/2019/extlst" xmlns:r="http://schemas.openxmlformats.org/officeDocument/2006/relationships" xmlns:wp14="http://schemas.microsoft.com/office/word/2010/wordprocessingDrawing" xmlns:wp="http://schemas.openxmlformats.org/drawingml/2006/wordprocessingDrawing" xmlns:wpg="http://schemas.microsoft.com/office/word/2010/wordprocessingGroup" xmlns:wpi="http://schemas.microsoft.com/office/word/2010/wordprocessingInk" xmlns:wps="http://schemas.microsoft.com/office/word/2010/wordprocessingShape" xmlns:o="urn:schemas-microsoft-com:office:office" xmlns:v="urn:schemas-microsoft-com:vml" xmlns:w10="urn:schemas-microsoft-com:office:word" xmlns:w="http://schemas.openxmlformats.org/wordprocessingml/2006/main" xmlns:w14="http://schemas.microsoft.com/office/word/2010/wordml" xmlns:w15="http://schemas.microsoft.com/office/word/2012/wordml" xmlns:w16cex="http://schemas.microsoft.com/office/word/2018/wordml/cex" xmlns:w16cid="http://schemas.microsoft.com/office/word/2016/wordml/cid" xmlns:w16="http://schemas.microsoft.com/office/word/2018/wordml" xmlns:w16sdtdh="http://schemas.microsoft.com/office/word/2020/wordml/sdtdatahash" xmlns:w16sdtfl="http://schemas.microsoft.com/office/word/2024/wordml/sdtformatlock" xmlns:w16se="http://schemas.microsoft.com/office/word/2015/wordml/symex" xmlns:w16du="http://schemas.microsoft.com/office/word/2023/wordml/word16du" xmlns:wne="http://schemas.microsoft.com/office/word/2006/wordml" mc:Ignorable="w14 w15 w16se w16cid w16 w16cex w16sdtdh w16sdtfl w16du wp14">
+<w:document xmlns:wpc="http://schemas.microsoft.com/office/word/2010/wordprocessingCanvas" xmlns:cx="http://schemas.microsoft.com/office/drawing/2014/chartex" xmlns:cx1="http://schemas.microsoft.com/office/drawing/2015/9/8/chartex" xmlns:cx2="http://schemas.microsoft.com/office/drawing/2015/10/21/chartex" xmlns:cx3="http://schemas.microsoft.com/office/drawing/2016/5/9/chartex" xmlns:cx4="http://schemas.microsoft.com/office/drawing/2016/5/10/chartex" xmlns:cx5="http://schemas.microsoft.com/office/drawing/2016/5/11/chartex" xmlns:cx6="http://schemas.microsoft.com/office/drawing/2016/5/12/chartex" xmlns:cx7="http://schemas.microsoft.com/office/drawing/2016/5/13/chartex" xmlns:cx8="http://schemas.microsoft.com/office/drawing/2016/5/14/chartex" xmlns:mc="http://schemas.openxmlformats.org/markup-compatibility/2006" xmlns:aink="http://schemas.microsoft.com/office/drawing/2016/ink" xmlns:am3d="http://schemas.microsoft.com/office/drawing/2017/model3d" xmlns:o="urn:schemas-microsoft-com:office:office" xmlns:oel="http://schemas.microsoft.com/office/2019/extlst" xmlns:r="http://schemas.openxmlformats.org/officeDocument/2006/relationships" xmlns:m="http://schemas.openxmlformats.org/officeDocument/2006/math" xmlns:v="urn:schemas-microsoft-com:vml" xmlns:wp14="http://schemas.microsoft.com/office/word/2010/wordprocessingDrawing" xmlns:wp="http://schemas.openxmlformats.org/drawingml/2006/wordprocessingDrawing" xmlns:w10="urn:schemas-microsoft-com:office:word" xmlns:w="http://schemas.openxmlformats.org/wordprocessingml/2006/main" xmlns:w14="http://schemas.microsoft.com/office/word/2010/wordml" xmlns:w15="http://schemas.microsoft.com/office/word/2012/wordml" xmlns:w16cex="http://schemas.microsoft.com/office/word/2018/wordml/cex" xmlns:w16cid="http://schemas.microsoft.com/office/word/2016/wordml/cid" xmlns:w16="http://schemas.microsoft.com/office/word/2018/wordml" xmlns:w16du="http://schemas.microsoft.com/office/word/2023/wordml/word16du" xmlns:w16sdtdh="http://schemas.microsoft.com/office/word/2020/wordml/sdtdatahash" xmlns:w16sdtfl="http://schemas.microsoft.com/office/word/2024/wordml/sdtformatlock" xmlns:w16se="http://schemas.microsoft.com/office/word/2015/wordml/symex" xmlns:wpg="http://schemas.microsoft.com/office/word/2010/wordprocessingGroup" xmlns:wpi="http://schemas.microsoft.com/office/word/2010/wordprocessingInk" xmlns:wne="http://schemas.microsoft.com/office/word/2006/wordml" xmlns:wps="http://schemas.microsoft.com/office/word/2010/wordprocessingShape" mc:Ignorable="w14 w15 w16se w16cid w16 w16cex w16sdtdh w16sdtfl w16du wp14">
   <w:body>
     <w:p>
       <w:pPr>
@@ -29,39 +29,7 @@
           <w:rFonts w:eastAsia="Times New Roman" w:cs="Times New Roman"/>
           <w:szCs w:val="24"/>
         </w:rPr>
-        <w:t xml:space="preserve">{{p </w:t>
-      </w:r>
-      <w:proofErr w:type="spellStart"/>
-      <w:r>
-        <w:rPr>
-          <w:rFonts w:eastAsia="Times New Roman" w:cs="Times New Roman"/>
-          <w:szCs w:val="24"/>
-        </w:rPr>
-        <w:t>include_docx_</w:t>
-      </w:r>
-      <w:proofErr w:type="gramStart"/>
-      <w:r>
-        <w:rPr>
-          <w:rFonts w:eastAsia="Times New Roman" w:cs="Times New Roman"/>
-          <w:szCs w:val="24"/>
-        </w:rPr>
-        <w:t>template</w:t>
-      </w:r>
-      <w:proofErr w:type="spellEnd"/>
-      <w:r>
-        <w:rPr>
-          <w:rFonts w:eastAsia="Times New Roman" w:cs="Times New Roman"/>
-          <w:szCs w:val="24"/>
-        </w:rPr>
-        <w:t>(</w:t>
-      </w:r>
-      <w:proofErr w:type="gramEnd"/>
-      <w:r>
-        <w:rPr>
-          <w:rFonts w:eastAsia="Times New Roman" w:cs="Times New Roman"/>
-          <w:szCs w:val="24"/>
-        </w:rPr>
-        <w:t>'include_caption.docx',</w:t>
+        <w:t>{{p include_docx_template('include_caption.docx',</w:t>
       </w:r>
       <w:r>
         <w:rPr>
@@ -70,53 +38,26 @@
         </w:rPr>
         <w:t xml:space="preserve"> </w:t>
       </w:r>
-      <w:proofErr w:type="spellStart"/>
       <w:r>
         <w:rPr>
           <w:rFonts w:eastAsia="Times New Roman" w:cs="Times New Roman"/>
           <w:szCs w:val="24"/>
         </w:rPr>
-        <w:t>caption_title</w:t>
-      </w:r>
-      <w:proofErr w:type="spellEnd"/>
-      <w:proofErr w:type="gramStart"/>
+        <w:t>caption_title=</w:t>
+      </w:r>
       <w:r>
         <w:rPr>
           <w:rFonts w:eastAsia="Times New Roman" w:cs="Times New Roman"/>
           <w:szCs w:val="24"/>
         </w:rPr>
-        <w:t>=</w:t>
+        <w:t>“”</w:t>
       </w:r>
       <w:r>
         <w:rPr>
           <w:rFonts w:eastAsia="Times New Roman" w:cs="Times New Roman"/>
           <w:szCs w:val="24"/>
         </w:rPr>
-        <w:t>“</w:t>
-      </w:r>
-      <w:proofErr w:type="gramEnd"/>
-      <w:r>
-        <w:rPr>
-          <w:rFonts w:eastAsia="Times New Roman" w:cs="Times New Roman"/>
-          <w:szCs w:val="24"/>
-        </w:rPr>
-        <w:t>”</w:t>
-      </w:r>
-      <w:proofErr w:type="gramStart"/>
-      <w:r>
-        <w:rPr>
-          <w:rFonts w:eastAsia="Times New Roman" w:cs="Times New Roman"/>
-          <w:szCs w:val="24"/>
-        </w:rPr>
-        <w:t>) }</w:t>
-      </w:r>
-      <w:proofErr w:type="gramEnd"/>
-      <w:r>
-        <w:rPr>
-          <w:rFonts w:eastAsia="Times New Roman" w:cs="Times New Roman"/>
-          <w:szCs w:val="24"/>
-        </w:rPr>
-        <w:t>}</w:t>
+        <w:t>) }}</w:t>
       </w:r>
     </w:p>
     <w:p>
@@ -154,15 +95,7 @@
         <w:pStyle w:val="BodyText"/>
       </w:pPr>
       <w:r>
-        <w:t xml:space="preserve">We are Defendants </w:t>
-      </w:r>
-      <w:proofErr w:type="gramStart"/>
-      <w:r>
-        <w:t>{{ users</w:t>
-      </w:r>
-      <w:proofErr w:type="gramEnd"/>
-      <w:r>
-        <w:t xml:space="preserve"> }}. We are representing ourselves.</w:t>
+        <w:t>We are Defendants {{ users }}. We are representing ourselves.</w:t>
       </w:r>
     </w:p>
     <w:p>
@@ -178,23 +111,7 @@
         <w:pStyle w:val="BodyText"/>
       </w:pPr>
       <w:r>
-        <w:t xml:space="preserve">I, </w:t>
-      </w:r>
-      <w:proofErr w:type="gramStart"/>
-      <w:r>
-        <w:t>{{ users</w:t>
-      </w:r>
-      <w:proofErr w:type="gramEnd"/>
-      <w:r>
-        <w:t>[0</w:t>
-      </w:r>
-      <w:proofErr w:type="gramStart"/>
-      <w:r>
-        <w:t>] }</w:t>
-      </w:r>
-      <w:proofErr w:type="gramEnd"/>
-      <w:r>
-        <w:t>}, am the Defendant in this case. I am representing myself.</w:t>
+        <w:t>I, {{ users[0] }}, am the Defendant in this case. I am representing myself.</w:t>
       </w:r>
     </w:p>
     <w:p>
@@ -232,45 +149,8 @@
           <w:numId w:val="12"/>
         </w:numPr>
       </w:pPr>
-      <w:proofErr w:type="gramStart"/>
-      <w:r>
-        <w:t xml:space="preserve">{{ </w:t>
-      </w:r>
-      <w:proofErr w:type="spellStart"/>
-      <w:r>
-        <w:t>single</w:t>
-      </w:r>
-      <w:proofErr w:type="gramEnd"/>
-      <w:r>
-        <w:t>_paragraph</w:t>
-      </w:r>
-      <w:proofErr w:type="spellEnd"/>
-      <w:r>
-        <w:t>(</w:t>
-      </w:r>
-      <w:proofErr w:type="spellStart"/>
-      <w:r>
-        <w:t>fix_punctuation</w:t>
-      </w:r>
-      <w:proofErr w:type="spellEnd"/>
-      <w:r>
-        <w:t>(</w:t>
-      </w:r>
-      <w:proofErr w:type="spellStart"/>
-      <w:r>
-        <w:t>merged_counterclaims_text</w:t>
-      </w:r>
-      <w:proofErr w:type="spellEnd"/>
-      <w:r>
-        <w:t>)</w:t>
-      </w:r>
-      <w:proofErr w:type="gramStart"/>
-      <w:r>
-        <w:t>) }</w:t>
-      </w:r>
-      <w:proofErr w:type="gramEnd"/>
-      <w:r>
-        <w:t>}</w:t>
+      <w:r>
+        <w:t>{{ single_paragraph(fix_punctuation(merged_counterclaims_text)) }}</w:t>
       </w:r>
     </w:p>
     <w:p>
@@ -298,15 +178,7 @@
         </w:numPr>
       </w:pPr>
       <w:r>
-        <w:t>{%p if defined("</w:t>
-      </w:r>
-      <w:proofErr w:type="spellStart"/>
-      <w:r>
-        <w:t>counterclaims_amount</w:t>
-      </w:r>
-      <w:proofErr w:type="spellEnd"/>
-      <w:r>
-        <w:t>") %}</w:t>
+        <w:t>{%p if defined("counterclaims_amount") %}</w:t>
       </w:r>
     </w:p>
     <w:p>
@@ -318,28 +190,7 @@
         </w:numPr>
       </w:pPr>
       <w:r>
-        <w:t xml:space="preserve">Defendant is asking for money damages of </w:t>
-      </w:r>
-      <w:proofErr w:type="gramStart"/>
-      <w:r>
-        <w:t>{{ currency</w:t>
-      </w:r>
-      <w:proofErr w:type="gramEnd"/>
-      <w:r>
-        <w:t>(</w:t>
-      </w:r>
-      <w:proofErr w:type="spellStart"/>
-      <w:r>
-        <w:t>counterclaims_amount</w:t>
-      </w:r>
-      <w:proofErr w:type="spellEnd"/>
-      <w:proofErr w:type="gramStart"/>
-      <w:r>
-        <w:t>) }</w:t>
-      </w:r>
-      <w:proofErr w:type="gramEnd"/>
-      <w:r>
-        <w:t>}.</w:t>
+        <w:t>Defendant is asking for money damages of {{ currency(counterclaims_amount) }}.</w:t>
       </w:r>
     </w:p>
     <w:p>
@@ -363,31 +214,7 @@
         </w:numPr>
       </w:pPr>
       <w:r>
-        <w:t xml:space="preserve">{%p for relief in </w:t>
-      </w:r>
-      <w:proofErr w:type="spellStart"/>
-      <w:r>
-        <w:t>counterclaim_</w:t>
-      </w:r>
-      <w:proofErr w:type="gramStart"/>
-      <w:r>
-        <w:t>reliefs.complete</w:t>
-      </w:r>
-      <w:proofErr w:type="gramEnd"/>
-      <w:r>
-        <w:t>_</w:t>
-      </w:r>
-      <w:proofErr w:type="gramStart"/>
-      <w:r>
-        <w:t>elements</w:t>
-      </w:r>
-      <w:proofErr w:type="spellEnd"/>
-      <w:r>
-        <w:t>(</w:t>
-      </w:r>
-      <w:proofErr w:type="gramEnd"/>
-      <w:r>
-        <w:t>) %}</w:t>
+        <w:t>{%p for relief in counterclaim_reliefs.complete_elements() %}</w:t>
       </w:r>
     </w:p>
     <w:p>
@@ -398,7 +225,6 @@
           <w:numId w:val="9"/>
         </w:numPr>
       </w:pPr>
-      <w:proofErr w:type="gramStart"/>
       <w:r>
         <w:t xml:space="preserve">{{ </w:t>
       </w:r>
@@ -408,7 +234,6 @@
       <w:r>
         <w:t>.name</w:t>
       </w:r>
-      <w:proofErr w:type="gramEnd"/>
       <w:r>
         <w:t xml:space="preserve"> }}</w:t>
       </w:r>
@@ -422,15 +247,7 @@
         </w:numPr>
       </w:pPr>
       <w:r>
-        <w:t xml:space="preserve">{%p </w:t>
-      </w:r>
-      <w:proofErr w:type="spellStart"/>
-      <w:r>
-        <w:t>endfor</w:t>
-      </w:r>
-      <w:proofErr w:type="spellEnd"/>
-      <w:r>
-        <w:t xml:space="preserve"> %}</w:t>
+        <w:t>{%p endfor %}</w:t>
       </w:r>
     </w:p>
     <w:p>
@@ -483,7 +300,13 @@
         <w:t xml:space="preserve">Defendant is </w:t>
       </w:r>
       <w:r>
-        <w:t>sending a copy of this Answer (and any attachments) to every party in the case (Plaintiffs and Defendants). This includes a Certificate of Service form, which I will also file with the court to show I sent the documents.</w:t>
+        <w:t xml:space="preserve">sending a copy of this </w:t>
+      </w:r>
+      <w:r>
+        <w:t>Counterclaim</w:t>
+      </w:r>
+      <w:r>
+        <w:t xml:space="preserve"> (and any attachments) to every party in the case (Plaintiffs and Defendants). This includes a Certificate of Service form, which I will also file with the court to show I sent the documents.</w:t>
       </w:r>
     </w:p>
     <w:p>
@@ -584,23 +407,7 @@
         <w:pStyle w:val="BodyText"/>
       </w:pPr>
       <w:r>
-        <w:t xml:space="preserve">{{p </w:t>
-      </w:r>
-      <w:proofErr w:type="spellStart"/>
-      <w:r>
-        <w:t>include_docx_template</w:t>
-      </w:r>
-      <w:proofErr w:type="spellEnd"/>
-      <w:r>
-        <w:t>('include_signature.docx'</w:t>
-      </w:r>
-      <w:proofErr w:type="gramStart"/>
-      <w:r>
-        <w:t>) }</w:t>
-      </w:r>
-      <w:proofErr w:type="gramEnd"/>
-      <w:r>
-        <w:t>}</w:t>
+        <w:t>{{p include_docx_template('include_signature.docx') }}</w:t>
       </w:r>
     </w:p>
     <w:sectPr>
@@ -616,7 +423,7 @@
 </file>
 
 <file path=word/endnotes.xml><?xml version="1.0" encoding="utf-8"?>
-<w:endnotes xmlns:wpc="http://schemas.microsoft.com/office/word/2010/wordprocessingCanvas" xmlns:cx="http://schemas.microsoft.com/office/drawing/2014/chartex" xmlns:cx1="http://schemas.microsoft.com/office/drawing/2015/9/8/chartex" xmlns:cx2="http://schemas.microsoft.com/office/drawing/2015/10/21/chartex" xmlns:cx3="http://schemas.microsoft.com/office/drawing/2016/5/9/chartex" xmlns:cx4="http://schemas.microsoft.com/office/drawing/2016/5/10/chartex" xmlns:cx5="http://schemas.microsoft.com/office/drawing/2016/5/11/chartex" xmlns:cx6="http://schemas.microsoft.com/office/drawing/2016/5/12/chartex" xmlns:cx7="http://schemas.microsoft.com/office/drawing/2016/5/13/chartex" xmlns:cx8="http://schemas.microsoft.com/office/drawing/2016/5/14/chartex" xmlns:mc="http://schemas.openxmlformats.org/markup-compatibility/2006" xmlns:m="http://schemas.openxmlformats.org/officeDocument/2006/math" xmlns:aink="http://schemas.microsoft.com/office/drawing/2016/ink" xmlns:am3d="http://schemas.microsoft.com/office/drawing/2017/model3d" xmlns:oel="http://schemas.microsoft.com/office/2019/extlst" xmlns:r="http://schemas.openxmlformats.org/officeDocument/2006/relationships" xmlns:wp14="http://schemas.microsoft.com/office/word/2010/wordprocessingDrawing" xmlns:wp="http://schemas.openxmlformats.org/drawingml/2006/wordprocessingDrawing" xmlns:wpg="http://schemas.microsoft.com/office/word/2010/wordprocessingGroup" xmlns:wpi="http://schemas.microsoft.com/office/word/2010/wordprocessingInk" xmlns:wps="http://schemas.microsoft.com/office/word/2010/wordprocessingShape" xmlns:o="urn:schemas-microsoft-com:office:office" xmlns:v="urn:schemas-microsoft-com:vml" xmlns:w10="urn:schemas-microsoft-com:office:word" xmlns:w="http://schemas.openxmlformats.org/wordprocessingml/2006/main" xmlns:w14="http://schemas.microsoft.com/office/word/2010/wordml" xmlns:w15="http://schemas.microsoft.com/office/word/2012/wordml" xmlns:w16cex="http://schemas.microsoft.com/office/word/2018/wordml/cex" xmlns:w16cid="http://schemas.microsoft.com/office/word/2016/wordml/cid" xmlns:w16="http://schemas.microsoft.com/office/word/2018/wordml" xmlns:w16sdtdh="http://schemas.microsoft.com/office/word/2020/wordml/sdtdatahash" xmlns:w16sdtfl="http://schemas.microsoft.com/office/word/2024/wordml/sdtformatlock" xmlns:w16se="http://schemas.microsoft.com/office/word/2015/wordml/symex" xmlns:w16du="http://schemas.microsoft.com/office/word/2023/wordml/word16du" xmlns:wne="http://schemas.microsoft.com/office/word/2006/wordml" mc:Ignorable="w14 w15 w16se w16cid w16 w16cex w16sdtdh w16sdtfl w16du wp14">
+<w:endnotes xmlns:wpc="http://schemas.microsoft.com/office/word/2010/wordprocessingCanvas" xmlns:cx="http://schemas.microsoft.com/office/drawing/2014/chartex" xmlns:cx1="http://schemas.microsoft.com/office/drawing/2015/9/8/chartex" xmlns:cx2="http://schemas.microsoft.com/office/drawing/2015/10/21/chartex" xmlns:cx3="http://schemas.microsoft.com/office/drawing/2016/5/9/chartex" xmlns:cx4="http://schemas.microsoft.com/office/drawing/2016/5/10/chartex" xmlns:cx5="http://schemas.microsoft.com/office/drawing/2016/5/11/chartex" xmlns:cx6="http://schemas.microsoft.com/office/drawing/2016/5/12/chartex" xmlns:cx7="http://schemas.microsoft.com/office/drawing/2016/5/13/chartex" xmlns:cx8="http://schemas.microsoft.com/office/drawing/2016/5/14/chartex" xmlns:mc="http://schemas.openxmlformats.org/markup-compatibility/2006" xmlns:aink="http://schemas.microsoft.com/office/drawing/2016/ink" xmlns:am3d="http://schemas.microsoft.com/office/drawing/2017/model3d" xmlns:o="urn:schemas-microsoft-com:office:office" xmlns:oel="http://schemas.microsoft.com/office/2019/extlst" xmlns:r="http://schemas.openxmlformats.org/officeDocument/2006/relationships" xmlns:m="http://schemas.openxmlformats.org/officeDocument/2006/math" xmlns:v="urn:schemas-microsoft-com:vml" xmlns:wp14="http://schemas.microsoft.com/office/word/2010/wordprocessingDrawing" xmlns:wp="http://schemas.openxmlformats.org/drawingml/2006/wordprocessingDrawing" xmlns:w10="urn:schemas-microsoft-com:office:word" xmlns:w="http://schemas.openxmlformats.org/wordprocessingml/2006/main" xmlns:w14="http://schemas.microsoft.com/office/word/2010/wordml" xmlns:w15="http://schemas.microsoft.com/office/word/2012/wordml" xmlns:w16cex="http://schemas.microsoft.com/office/word/2018/wordml/cex" xmlns:w16cid="http://schemas.microsoft.com/office/word/2016/wordml/cid" xmlns:w16="http://schemas.microsoft.com/office/word/2018/wordml" xmlns:w16du="http://schemas.microsoft.com/office/word/2023/wordml/word16du" xmlns:w16sdtdh="http://schemas.microsoft.com/office/word/2020/wordml/sdtdatahash" xmlns:w16sdtfl="http://schemas.microsoft.com/office/word/2024/wordml/sdtformatlock" xmlns:w16se="http://schemas.microsoft.com/office/word/2015/wordml/symex" xmlns:wpg="http://schemas.microsoft.com/office/word/2010/wordprocessingGroup" xmlns:wpi="http://schemas.microsoft.com/office/word/2010/wordprocessingInk" xmlns:wne="http://schemas.microsoft.com/office/word/2006/wordml" xmlns:wps="http://schemas.microsoft.com/office/word/2010/wordprocessingShape" mc:Ignorable="w14 w15 w16se w16cid w16 w16cex w16sdtdh w16sdtfl w16du wp14">
   <w:endnote w:type="separator" w:id="-1">
     <w:p>
       <w:r>
@@ -635,7 +442,7 @@
 </file>
 
 <file path=word/footer1.xml><?xml version="1.0" encoding="utf-8"?>
-<w:ftr xmlns:wpc="http://schemas.microsoft.com/office/word/2010/wordprocessingCanvas" xmlns:cx="http://schemas.microsoft.com/office/drawing/2014/chartex" xmlns:cx1="http://schemas.microsoft.com/office/drawing/2015/9/8/chartex" xmlns:cx2="http://schemas.microsoft.com/office/drawing/2015/10/21/chartex" xmlns:cx3="http://schemas.microsoft.com/office/drawing/2016/5/9/chartex" xmlns:cx4="http://schemas.microsoft.com/office/drawing/2016/5/10/chartex" xmlns:cx5="http://schemas.microsoft.com/office/drawing/2016/5/11/chartex" xmlns:cx6="http://schemas.microsoft.com/office/drawing/2016/5/12/chartex" xmlns:cx7="http://schemas.microsoft.com/office/drawing/2016/5/13/chartex" xmlns:cx8="http://schemas.microsoft.com/office/drawing/2016/5/14/chartex" xmlns:mc="http://schemas.openxmlformats.org/markup-compatibility/2006" xmlns:m="http://schemas.openxmlformats.org/officeDocument/2006/math" xmlns:aink="http://schemas.microsoft.com/office/drawing/2016/ink" xmlns:am3d="http://schemas.microsoft.com/office/drawing/2017/model3d" xmlns:oel="http://schemas.microsoft.com/office/2019/extlst" xmlns:r="http://schemas.openxmlformats.org/officeDocument/2006/relationships" xmlns:wp14="http://schemas.microsoft.com/office/word/2010/wordprocessingDrawing" xmlns:wp="http://schemas.openxmlformats.org/drawingml/2006/wordprocessingDrawing" xmlns:wpg="http://schemas.microsoft.com/office/word/2010/wordprocessingGroup" xmlns:wpi="http://schemas.microsoft.com/office/word/2010/wordprocessingInk" xmlns:wps="http://schemas.microsoft.com/office/word/2010/wordprocessingShape" xmlns:o="urn:schemas-microsoft-com:office:office" xmlns:v="urn:schemas-microsoft-com:vml" xmlns:w10="urn:schemas-microsoft-com:office:word" xmlns:w="http://schemas.openxmlformats.org/wordprocessingml/2006/main" xmlns:w14="http://schemas.microsoft.com/office/word/2010/wordml" xmlns:w15="http://schemas.microsoft.com/office/word/2012/wordml" xmlns:w16cex="http://schemas.microsoft.com/office/word/2018/wordml/cex" xmlns:w16cid="http://schemas.microsoft.com/office/word/2016/wordml/cid" xmlns:w16="http://schemas.microsoft.com/office/word/2018/wordml" xmlns:w16sdtdh="http://schemas.microsoft.com/office/word/2020/wordml/sdtdatahash" xmlns:w16sdtfl="http://schemas.microsoft.com/office/word/2024/wordml/sdtformatlock" xmlns:w16se="http://schemas.microsoft.com/office/word/2015/wordml/symex" xmlns:w16du="http://schemas.microsoft.com/office/word/2023/wordml/word16du" xmlns:wne="http://schemas.microsoft.com/office/word/2006/wordml" mc:Ignorable="w14 w15 w16se w16cid w16 w16cex w16sdtdh w16sdtfl w16du wp14">
+<w:ftr xmlns:wpc="http://schemas.microsoft.com/office/word/2010/wordprocessingCanvas" xmlns:cx="http://schemas.microsoft.com/office/drawing/2014/chartex" xmlns:cx1="http://schemas.microsoft.com/office/drawing/2015/9/8/chartex" xmlns:cx2="http://schemas.microsoft.com/office/drawing/2015/10/21/chartex" xmlns:cx3="http://schemas.microsoft.com/office/drawing/2016/5/9/chartex" xmlns:cx4="http://schemas.microsoft.com/office/drawing/2016/5/10/chartex" xmlns:cx5="http://schemas.microsoft.com/office/drawing/2016/5/11/chartex" xmlns:cx6="http://schemas.microsoft.com/office/drawing/2016/5/12/chartex" xmlns:cx7="http://schemas.microsoft.com/office/drawing/2016/5/13/chartex" xmlns:cx8="http://schemas.microsoft.com/office/drawing/2016/5/14/chartex" xmlns:mc="http://schemas.openxmlformats.org/markup-compatibility/2006" xmlns:aink="http://schemas.microsoft.com/office/drawing/2016/ink" xmlns:am3d="http://schemas.microsoft.com/office/drawing/2017/model3d" xmlns:o="urn:schemas-microsoft-com:office:office" xmlns:oel="http://schemas.microsoft.com/office/2019/extlst" xmlns:r="http://schemas.openxmlformats.org/officeDocument/2006/relationships" xmlns:m="http://schemas.openxmlformats.org/officeDocument/2006/math" xmlns:v="urn:schemas-microsoft-com:vml" xmlns:wp14="http://schemas.microsoft.com/office/word/2010/wordprocessingDrawing" xmlns:wp="http://schemas.openxmlformats.org/drawingml/2006/wordprocessingDrawing" xmlns:w10="urn:schemas-microsoft-com:office:word" xmlns:w="http://schemas.openxmlformats.org/wordprocessingml/2006/main" xmlns:w14="http://schemas.microsoft.com/office/word/2010/wordml" xmlns:w15="http://schemas.microsoft.com/office/word/2012/wordml" xmlns:w16cex="http://schemas.microsoft.com/office/word/2018/wordml/cex" xmlns:w16cid="http://schemas.microsoft.com/office/word/2016/wordml/cid" xmlns:w16="http://schemas.microsoft.com/office/word/2018/wordml" xmlns:w16du="http://schemas.microsoft.com/office/word/2023/wordml/word16du" xmlns:w16sdtdh="http://schemas.microsoft.com/office/word/2020/wordml/sdtdatahash" xmlns:w16sdtfl="http://schemas.microsoft.com/office/word/2024/wordml/sdtformatlock" xmlns:w16se="http://schemas.microsoft.com/office/word/2015/wordml/symex" xmlns:wpg="http://schemas.microsoft.com/office/word/2010/wordprocessingGroup" xmlns:wpi="http://schemas.microsoft.com/office/word/2010/wordprocessingInk" xmlns:wne="http://schemas.microsoft.com/office/word/2006/wordml" xmlns:wps="http://schemas.microsoft.com/office/word/2010/wordprocessingShape" mc:Ignorable="w14 w15 w16se w16cid w16 w16cex w16sdtdh w16sdtfl w16du wp14">
   <w:p>
     <w:pPr>
       <w:pStyle w:val="Footer"/>
@@ -767,25 +574,7 @@
         <w:sz w:val="20"/>
         <w:szCs w:val="20"/>
       </w:rPr>
-      <w:t xml:space="preserve">Prepared with </w:t>
-    </w:r>
-    <w:proofErr w:type="spellStart"/>
-    <w:r>
-      <w:rPr>
-        <w:rFonts w:cs="Times New Roman"/>
-        <w:sz w:val="20"/>
-        <w:szCs w:val="20"/>
-      </w:rPr>
-      <w:t>VTCourtForms</w:t>
-    </w:r>
-    <w:proofErr w:type="spellEnd"/>
-    <w:r>
-      <w:rPr>
-        <w:rFonts w:cs="Times New Roman"/>
-        <w:sz w:val="20"/>
-        <w:szCs w:val="20"/>
-      </w:rPr>
-      <w:t xml:space="preserve"> tool</w:t>
+      <w:t>Prepared with VTCourtForms tool</w:t>
     </w:r>
     <w:r>
       <w:rPr>
@@ -808,7 +597,7 @@
 </file>
 
 <file path=word/footnotes.xml><?xml version="1.0" encoding="utf-8"?>
-<w:footnotes xmlns:wpc="http://schemas.microsoft.com/office/word/2010/wordprocessingCanvas" xmlns:cx="http://schemas.microsoft.com/office/drawing/2014/chartex" xmlns:cx1="http://schemas.microsoft.com/office/drawing/2015/9/8/chartex" xmlns:cx2="http://schemas.microsoft.com/office/drawing/2015/10/21/chartex" xmlns:cx3="http://schemas.microsoft.com/office/drawing/2016/5/9/chartex" xmlns:cx4="http://schemas.microsoft.com/office/drawing/2016/5/10/chartex" xmlns:cx5="http://schemas.microsoft.com/office/drawing/2016/5/11/chartex" xmlns:cx6="http://schemas.microsoft.com/office/drawing/2016/5/12/chartex" xmlns:cx7="http://schemas.microsoft.com/office/drawing/2016/5/13/chartex" xmlns:cx8="http://schemas.microsoft.com/office/drawing/2016/5/14/chartex" xmlns:mc="http://schemas.openxmlformats.org/markup-compatibility/2006" xmlns:m="http://schemas.openxmlformats.org/officeDocument/2006/math" xmlns:aink="http://schemas.microsoft.com/office/drawing/2016/ink" xmlns:am3d="http://schemas.microsoft.com/office/drawing/2017/model3d" xmlns:oel="http://schemas.microsoft.com/office/2019/extlst" xmlns:r="http://schemas.openxmlformats.org/officeDocument/2006/relationships" xmlns:wp14="http://schemas.microsoft.com/office/word/2010/wordprocessingDrawing" xmlns:wp="http://schemas.openxmlformats.org/drawingml/2006/wordprocessingDrawing" xmlns:wpg="http://schemas.microsoft.com/office/word/2010/wordprocessingGroup" xmlns:wpi="http://schemas.microsoft.com/office/word/2010/wordprocessingInk" xmlns:wps="http://schemas.microsoft.com/office/word/2010/wordprocessingShape" xmlns:o="urn:schemas-microsoft-com:office:office" xmlns:v="urn:schemas-microsoft-com:vml" xmlns:w10="urn:schemas-microsoft-com:office:word" xmlns:w="http://schemas.openxmlformats.org/wordprocessingml/2006/main" xmlns:w14="http://schemas.microsoft.com/office/word/2010/wordml" xmlns:w15="http://schemas.microsoft.com/office/word/2012/wordml" xmlns:w16cex="http://schemas.microsoft.com/office/word/2018/wordml/cex" xmlns:w16cid="http://schemas.microsoft.com/office/word/2016/wordml/cid" xmlns:w16="http://schemas.microsoft.com/office/word/2018/wordml" xmlns:w16sdtdh="http://schemas.microsoft.com/office/word/2020/wordml/sdtdatahash" xmlns:w16sdtfl="http://schemas.microsoft.com/office/word/2024/wordml/sdtformatlock" xmlns:w16se="http://schemas.microsoft.com/office/word/2015/wordml/symex" xmlns:w16du="http://schemas.microsoft.com/office/word/2023/wordml/word16du" xmlns:wne="http://schemas.microsoft.com/office/word/2006/wordml" mc:Ignorable="w14 w15 w16se w16cid w16 w16cex w16sdtdh w16sdtfl w16du wp14">
+<w:footnotes xmlns:wpc="http://schemas.microsoft.com/office/word/2010/wordprocessingCanvas" xmlns:cx="http://schemas.microsoft.com/office/drawing/2014/chartex" xmlns:cx1="http://schemas.microsoft.com/office/drawing/2015/9/8/chartex" xmlns:cx2="http://schemas.microsoft.com/office/drawing/2015/10/21/chartex" xmlns:cx3="http://schemas.microsoft.com/office/drawing/2016/5/9/chartex" xmlns:cx4="http://schemas.microsoft.com/office/drawing/2016/5/10/chartex" xmlns:cx5="http://schemas.microsoft.com/office/drawing/2016/5/11/chartex" xmlns:cx6="http://schemas.microsoft.com/office/drawing/2016/5/12/chartex" xmlns:cx7="http://schemas.microsoft.com/office/drawing/2016/5/13/chartex" xmlns:cx8="http://schemas.microsoft.com/office/drawing/2016/5/14/chartex" xmlns:mc="http://schemas.openxmlformats.org/markup-compatibility/2006" xmlns:aink="http://schemas.microsoft.com/office/drawing/2016/ink" xmlns:am3d="http://schemas.microsoft.com/office/drawing/2017/model3d" xmlns:o="urn:schemas-microsoft-com:office:office" xmlns:oel="http://schemas.microsoft.com/office/2019/extlst" xmlns:r="http://schemas.openxmlformats.org/officeDocument/2006/relationships" xmlns:m="http://schemas.openxmlformats.org/officeDocument/2006/math" xmlns:v="urn:schemas-microsoft-com:vml" xmlns:wp14="http://schemas.microsoft.com/office/word/2010/wordprocessingDrawing" xmlns:wp="http://schemas.openxmlformats.org/drawingml/2006/wordprocessingDrawing" xmlns:w10="urn:schemas-microsoft-com:office:word" xmlns:w="http://schemas.openxmlformats.org/wordprocessingml/2006/main" xmlns:w14="http://schemas.microsoft.com/office/word/2010/wordml" xmlns:w15="http://schemas.microsoft.com/office/word/2012/wordml" xmlns:w16cex="http://schemas.microsoft.com/office/word/2018/wordml/cex" xmlns:w16cid="http://schemas.microsoft.com/office/word/2016/wordml/cid" xmlns:w16="http://schemas.microsoft.com/office/word/2018/wordml" xmlns:w16du="http://schemas.microsoft.com/office/word/2023/wordml/word16du" xmlns:w16sdtdh="http://schemas.microsoft.com/office/word/2020/wordml/sdtdatahash" xmlns:w16sdtfl="http://schemas.microsoft.com/office/word/2024/wordml/sdtformatlock" xmlns:w16se="http://schemas.microsoft.com/office/word/2015/wordml/symex" xmlns:wpg="http://schemas.microsoft.com/office/word/2010/wordprocessingGroup" xmlns:wpi="http://schemas.microsoft.com/office/word/2010/wordprocessingInk" xmlns:wne="http://schemas.microsoft.com/office/word/2006/wordml" xmlns:wps="http://schemas.microsoft.com/office/word/2010/wordprocessingShape" mc:Ignorable="w14 w15 w16se w16cid w16 w16cex w16sdtdh w16sdtfl w16du wp14">
   <w:footnote w:type="separator" w:id="-1">
     <w:p>
       <w:r>
@@ -827,7 +616,7 @@
 </file>
 
 <file path=word/numbering.xml><?xml version="1.0" encoding="utf-8"?>
-<w:numbering xmlns:wpc="http://schemas.microsoft.com/office/word/2010/wordprocessingCanvas" xmlns:cx="http://schemas.microsoft.com/office/drawing/2014/chartex" xmlns:cx1="http://schemas.microsoft.com/office/drawing/2015/9/8/chartex" xmlns:cx2="http://schemas.microsoft.com/office/drawing/2015/10/21/chartex" xmlns:cx3="http://schemas.microsoft.com/office/drawing/2016/5/9/chartex" xmlns:cx4="http://schemas.microsoft.com/office/drawing/2016/5/10/chartex" xmlns:cx5="http://schemas.microsoft.com/office/drawing/2016/5/11/chartex" xmlns:cx6="http://schemas.microsoft.com/office/drawing/2016/5/12/chartex" xmlns:cx7="http://schemas.microsoft.com/office/drawing/2016/5/13/chartex" xmlns:cx8="http://schemas.microsoft.com/office/drawing/2016/5/14/chartex" xmlns:mc="http://schemas.openxmlformats.org/markup-compatibility/2006" xmlns:m="http://schemas.openxmlformats.org/officeDocument/2006/math" xmlns:aink="http://schemas.microsoft.com/office/drawing/2016/ink" xmlns:am3d="http://schemas.microsoft.com/office/drawing/2017/model3d" xmlns:oel="http://schemas.microsoft.com/office/2019/extlst" xmlns:r="http://schemas.openxmlformats.org/officeDocument/2006/relationships" xmlns:wp14="http://schemas.microsoft.com/office/word/2010/wordprocessingDrawing" xmlns:wp="http://schemas.openxmlformats.org/drawingml/2006/wordprocessingDrawing" xmlns:wpg="http://schemas.microsoft.com/office/word/2010/wordprocessingGroup" xmlns:wpi="http://schemas.microsoft.com/office/word/2010/wordprocessingInk" xmlns:wps="http://schemas.microsoft.com/office/word/2010/wordprocessingShape" xmlns:o="urn:schemas-microsoft-com:office:office" xmlns:v="urn:schemas-microsoft-com:vml" xmlns:w10="urn:schemas-microsoft-com:office:word" xmlns:w="http://schemas.openxmlformats.org/wordprocessingml/2006/main" xmlns:w14="http://schemas.microsoft.com/office/word/2010/wordml" xmlns:w15="http://schemas.microsoft.com/office/word/2012/wordml" xmlns:w16cex="http://schemas.microsoft.com/office/word/2018/wordml/cex" xmlns:w16cid="http://schemas.microsoft.com/office/word/2016/wordml/cid" xmlns:w16="http://schemas.microsoft.com/office/word/2018/wordml" xmlns:w16sdtdh="http://schemas.microsoft.com/office/word/2020/wordml/sdtdatahash" xmlns:w16sdtfl="http://schemas.microsoft.com/office/word/2024/wordml/sdtformatlock" xmlns:w16se="http://schemas.microsoft.com/office/word/2015/wordml/symex" xmlns:w16du="http://schemas.microsoft.com/office/word/2023/wordml/word16du" xmlns:wne="http://schemas.microsoft.com/office/word/2006/wordml" mc:Ignorable="w14 w15 w16se w16cid w16 w16cex w16sdtdh w16sdtfl w16du wp14">
+<w:numbering xmlns:wpc="http://schemas.microsoft.com/office/word/2010/wordprocessingCanvas" xmlns:cx="http://schemas.microsoft.com/office/drawing/2014/chartex" xmlns:cx1="http://schemas.microsoft.com/office/drawing/2015/9/8/chartex" xmlns:cx2="http://schemas.microsoft.com/office/drawing/2015/10/21/chartex" xmlns:cx3="http://schemas.microsoft.com/office/drawing/2016/5/9/chartex" xmlns:cx4="http://schemas.microsoft.com/office/drawing/2016/5/10/chartex" xmlns:cx5="http://schemas.microsoft.com/office/drawing/2016/5/11/chartex" xmlns:cx6="http://schemas.microsoft.com/office/drawing/2016/5/12/chartex" xmlns:cx7="http://schemas.microsoft.com/office/drawing/2016/5/13/chartex" xmlns:cx8="http://schemas.microsoft.com/office/drawing/2016/5/14/chartex" xmlns:mc="http://schemas.openxmlformats.org/markup-compatibility/2006" xmlns:aink="http://schemas.microsoft.com/office/drawing/2016/ink" xmlns:am3d="http://schemas.microsoft.com/office/drawing/2017/model3d" xmlns:o="urn:schemas-microsoft-com:office:office" xmlns:oel="http://schemas.microsoft.com/office/2019/extlst" xmlns:r="http://schemas.openxmlformats.org/officeDocument/2006/relationships" xmlns:m="http://schemas.openxmlformats.org/officeDocument/2006/math" xmlns:v="urn:schemas-microsoft-com:vml" xmlns:wp14="http://schemas.microsoft.com/office/word/2010/wordprocessingDrawing" xmlns:wp="http://schemas.openxmlformats.org/drawingml/2006/wordprocessingDrawing" xmlns:w10="urn:schemas-microsoft-com:office:word" xmlns:w="http://schemas.openxmlformats.org/wordprocessingml/2006/main" xmlns:w14="http://schemas.microsoft.com/office/word/2010/wordml" xmlns:w15="http://schemas.microsoft.com/office/word/2012/wordml" xmlns:w16cex="http://schemas.microsoft.com/office/word/2018/wordml/cex" xmlns:w16cid="http://schemas.microsoft.com/office/word/2016/wordml/cid" xmlns:w16="http://schemas.microsoft.com/office/word/2018/wordml" xmlns:w16du="http://schemas.microsoft.com/office/word/2023/wordml/word16du" xmlns:w16sdtdh="http://schemas.microsoft.com/office/word/2020/wordml/sdtdatahash" xmlns:w16sdtfl="http://schemas.microsoft.com/office/word/2024/wordml/sdtformatlock" xmlns:w16se="http://schemas.microsoft.com/office/word/2015/wordml/symex" xmlns:wpg="http://schemas.microsoft.com/office/word/2010/wordprocessingGroup" xmlns:wpi="http://schemas.microsoft.com/office/word/2010/wordprocessingInk" xmlns:wne="http://schemas.microsoft.com/office/word/2006/wordml" xmlns:wps="http://schemas.microsoft.com/office/word/2010/wordprocessingShape" mc:Ignorable="w14 w15 w16se w16cid w16 w16cex w16sdtdh w16sdtfl w16du wp14">
   <w:abstractNum w:abstractNumId="0" w15:restartNumberingAfterBreak="0">
     <w:nsid w:val="05BA618A"/>
     <w:multiLevelType w:val="hybridMultilevel"/>
@@ -2062,7 +1851,7 @@
 </file>
 
 <file path=word/styles.xml><?xml version="1.0" encoding="utf-8"?>
-<w:styles xmlns:mc="http://schemas.openxmlformats.org/markup-compatibility/2006" xmlns:r="http://schemas.openxmlformats.org/officeDocument/2006/relationships" xmlns:w="http://schemas.openxmlformats.org/wordprocessingml/2006/main" xmlns:w14="http://schemas.microsoft.com/office/word/2010/wordml" xmlns:w15="http://schemas.microsoft.com/office/word/2012/wordml" xmlns:w16cex="http://schemas.microsoft.com/office/word/2018/wordml/cex" xmlns:w16cid="http://schemas.microsoft.com/office/word/2016/wordml/cid" xmlns:w16="http://schemas.microsoft.com/office/word/2018/wordml" xmlns:w16sdtdh="http://schemas.microsoft.com/office/word/2020/wordml/sdtdatahash" xmlns:w16sdtfl="http://schemas.microsoft.com/office/word/2024/wordml/sdtformatlock" xmlns:w16se="http://schemas.microsoft.com/office/word/2015/wordml/symex" xmlns:w16du="http://schemas.microsoft.com/office/word/2023/wordml/word16du" mc:Ignorable="w14 w15 w16se w16cid w16 w16cex w16sdtdh w16sdtfl w16du">
+<w:styles xmlns:mc="http://schemas.openxmlformats.org/markup-compatibility/2006" xmlns:r="http://schemas.openxmlformats.org/officeDocument/2006/relationships" xmlns:w="http://schemas.openxmlformats.org/wordprocessingml/2006/main" xmlns:w14="http://schemas.microsoft.com/office/word/2010/wordml" xmlns:w15="http://schemas.microsoft.com/office/word/2012/wordml" xmlns:w16cex="http://schemas.microsoft.com/office/word/2018/wordml/cex" xmlns:w16cid="http://schemas.microsoft.com/office/word/2016/wordml/cid" xmlns:w16="http://schemas.microsoft.com/office/word/2018/wordml" xmlns:w16du="http://schemas.microsoft.com/office/word/2023/wordml/word16du" xmlns:w16sdtdh="http://schemas.microsoft.com/office/word/2020/wordml/sdtdatahash" xmlns:w16sdtfl="http://schemas.microsoft.com/office/word/2024/wordml/sdtformatlock" xmlns:w16se="http://schemas.microsoft.com/office/word/2015/wordml/symex" mc:Ignorable="w14 w15 w16se w16cid w16 w16cex w16sdtdh w16sdtfl w16du">
   <w:docDefaults>
     <w:rPrDefault>
       <w:rPr>

</xml_diff>